<commit_message>
feat(ui): elevate UI with modern SaaS design, glassmorphism, interactive notifications, enhanced topology, and refreshed screenshots
</commit_message>
<xml_diff>
--- a/CNIP_Network_Manager_Abstract_and_Workflow.docx
+++ b/CNIP_Network_Manager_Abstract_and_Workflow.docx
@@ -6007,7 +6007,7 @@
       <w:r>
         <w:drawing>
           <wp:inline xmlns:a="http://schemas.openxmlformats.org/drawingml/2006/main" xmlns:pic="http://schemas.openxmlformats.org/drawingml/2006/picture">
-            <wp:extent cx="5669280" cy="5208651"/>
+            <wp:extent cx="5669280" cy="5682567"/>
             <wp:docPr id="2" name="Picture 2"/>
             <wp:cNvGraphicFramePr>
               <a:graphicFrameLocks noChangeAspect="1"/>
@@ -6028,7 +6028,7 @@
                   <pic:spPr>
                     <a:xfrm>
                       <a:off x="0" y="0"/>
-                      <a:ext cx="5669280" cy="5208651"/>
+                      <a:ext cx="5669280" cy="5682567"/>
                     </a:xfrm>
                     <a:prstGeom prst="rect"/>
                   </pic:spPr>
@@ -6235,7 +6235,7 @@
       <w:r>
         <w:drawing>
           <wp:inline xmlns:a="http://schemas.openxmlformats.org/drawingml/2006/main" xmlns:pic="http://schemas.openxmlformats.org/drawingml/2006/picture">
-            <wp:extent cx="5669280" cy="5044773"/>
+            <wp:extent cx="5669280" cy="6289358"/>
             <wp:docPr id="6" name="Picture 6"/>
             <wp:cNvGraphicFramePr>
               <a:graphicFrameLocks noChangeAspect="1"/>
@@ -6256,7 +6256,7 @@
                   <pic:spPr>
                     <a:xfrm>
                       <a:off x="0" y="0"/>
-                      <a:ext cx="5669280" cy="5044773"/>
+                      <a:ext cx="5669280" cy="6289358"/>
                     </a:xfrm>
                     <a:prstGeom prst="rect"/>
                   </pic:spPr>

</xml_diff>